<commit_message>
Minor updates to SOP
</commit_message>
<xml_diff>
--- a/cpfr-vc-mgrmicro/CPFR_VC_Vendor_Info_Manager_SOP.docx
+++ b/cpfr-vc-mgrmicro/CPFR_VC_Vendor_Info_Manager_SOP.docx
@@ -32,12 +32,6 @@
         <w:gridCol w:w="8712"/>
       </w:tblGrid>
       <w:tr>
-        <w:tblPrEx>
-          <w:tblCellMar>
-            <w:top w:w="0" w:type="dxa"/>
-            <w:bottom w:w="0" w:type="dxa"/>
-          </w:tblCellMar>
-        </w:tblPrEx>
         <w:tc>
           <w:tcPr>
             <w:tcW w:w="1800" w:type="dxa"/>
@@ -90,12 +84,6 @@
         </w:tc>
       </w:tr>
       <w:tr>
-        <w:tblPrEx>
-          <w:tblCellMar>
-            <w:top w:w="0" w:type="dxa"/>
-            <w:bottom w:w="0" w:type="dxa"/>
-          </w:tblCellMar>
-        </w:tblPrEx>
         <w:tc>
           <w:tcPr>
             <w:tcW w:w="1800" w:type="dxa"/>
@@ -148,12 +136,6 @@
         </w:tc>
       </w:tr>
       <w:tr>
-        <w:tblPrEx>
-          <w:tblCellMar>
-            <w:top w:w="0" w:type="dxa"/>
-            <w:bottom w:w="0" w:type="dxa"/>
-          </w:tblCellMar>
-        </w:tblPrEx>
         <w:tc>
           <w:tcPr>
             <w:tcW w:w="1800" w:type="dxa"/>
@@ -206,12 +188,6 @@
         </w:tc>
       </w:tr>
       <w:tr>
-        <w:tblPrEx>
-          <w:tblCellMar>
-            <w:top w:w="0" w:type="dxa"/>
-            <w:bottom w:w="0" w:type="dxa"/>
-          </w:tblCellMar>
-        </w:tblPrEx>
         <w:tc>
           <w:tcPr>
             <w:tcW w:w="1800" w:type="dxa"/>
@@ -400,12 +376,24 @@
       <w:pPr>
         <w:spacing w:before="120" w:after="120" w:line="264" w:lineRule="auto"/>
       </w:pPr>
-      <w:hyperlink r:id="rId7" w:history="1">
+      <w:hyperlink r:id="rId8" w:anchor="/apps/z3y7n6izoatbnpebwxgq" w:history="1">
         <w:r>
           <w:rPr>
             <w:rStyle w:val="Hyperlink"/>
           </w:rPr>
-          <w:t>https://app.snowflake.com/streamlit/chewy/chewy/#/apps/z3y7n6izoatbnpebwxgq</w:t>
+          <w:t>https://app.snowflake.com/streamlit/chewy/chewy/#/</w:t>
+        </w:r>
+        <w:r>
+          <w:rPr>
+            <w:rStyle w:val="Hyperlink"/>
+          </w:rPr>
+          <w:t>a</w:t>
+        </w:r>
+        <w:r>
+          <w:rPr>
+            <w:rStyle w:val="Hyperlink"/>
+          </w:rPr>
+          <w:t>pps/z3y7n6izoatbnpebwxgq</w:t>
         </w:r>
       </w:hyperlink>
     </w:p>
@@ -473,12 +461,6 @@
         <w:gridCol w:w="9167"/>
       </w:tblGrid>
       <w:tr>
-        <w:tblPrEx>
-          <w:tblCellMar>
-            <w:top w:w="0" w:type="dxa"/>
-            <w:bottom w:w="0" w:type="dxa"/>
-          </w:tblCellMar>
-        </w:tblPrEx>
         <w:tc>
           <w:tcPr>
             <w:tcW w:w="1345" w:type="dxa"/>
@@ -541,12 +523,6 @@
         </w:tc>
       </w:tr>
       <w:tr>
-        <w:tblPrEx>
-          <w:tblCellMar>
-            <w:top w:w="0" w:type="dxa"/>
-            <w:bottom w:w="0" w:type="dxa"/>
-          </w:tblCellMar>
-        </w:tblPrEx>
         <w:tc>
           <w:tcPr>
             <w:tcW w:w="1345" w:type="dxa"/>
@@ -599,12 +575,6 @@
         </w:tc>
       </w:tr>
       <w:tr>
-        <w:tblPrEx>
-          <w:tblCellMar>
-            <w:top w:w="0" w:type="dxa"/>
-            <w:bottom w:w="0" w:type="dxa"/>
-          </w:tblCellMar>
-        </w:tblPrEx>
         <w:tc>
           <w:tcPr>
             <w:tcW w:w="1345" w:type="dxa"/>
@@ -657,12 +627,6 @@
         </w:tc>
       </w:tr>
       <w:tr>
-        <w:tblPrEx>
-          <w:tblCellMar>
-            <w:top w:w="0" w:type="dxa"/>
-            <w:bottom w:w="0" w:type="dxa"/>
-          </w:tblCellMar>
-        </w:tblPrEx>
         <w:tc>
           <w:tcPr>
             <w:tcW w:w="1345" w:type="dxa"/>
@@ -726,12 +690,6 @@
         </w:tc>
       </w:tr>
       <w:tr>
-        <w:tblPrEx>
-          <w:tblCellMar>
-            <w:top w:w="0" w:type="dxa"/>
-            <w:bottom w:w="0" w:type="dxa"/>
-          </w:tblCellMar>
-        </w:tblPrEx>
         <w:tc>
           <w:tcPr>
             <w:tcW w:w="1345" w:type="dxa"/>
@@ -802,9 +760,26 @@
     </w:p>
     <w:p>
       <w:pPr>
+        <w:rPr>
+          <w:b/>
+          <w:bCs/>
+          <w:i/>
+          <w:iCs/>
+          <w:color w:val="000000"/>
+          <w:sz w:val="24"/>
+          <w:szCs w:val="24"/>
+        </w:rPr>
+      </w:pPr>
+      <w:r>
+        <w:br w:type="page"/>
+      </w:r>
+    </w:p>
+    <w:p>
+      <w:pPr>
         <w:pStyle w:val="Heading3"/>
       </w:pPr>
       <w:r>
+        <w:lastRenderedPageBreak/>
         <w:t>3.2 Email fields and how they control distribution</w:t>
       </w:r>
     </w:p>
@@ -838,11 +813,489 @@
         <w:t>Override Email</w:t>
       </w:r>
       <w:r>
-        <w:t xml:space="preserve"> is filled in, it takes over entirely from "Vendor Contacts" -- only those addresses receive reports, and Vendor Contacts is bypassed until Override Email is cleared. This is an effective way to "lock" a static list of vendor </w:t>
-      </w:r>
+        <w:t xml:space="preserve"> is filled in, it takes over entirely from "Vendor Contacts" -- only those addresses receive reports, and Vendor Contacts is bypassed until Override Email is cleared. This is an effective way to "lock" a static list of vendor contacts, or to ensure no external recipients. This field is not modified during standard updates, including batch updates.</w:t>
+      </w:r>
+    </w:p>
+    <w:p>
+      <w:pPr>
+        <w:pStyle w:val="ListBullet"/>
+      </w:pPr>
+      <w:r>
+        <w:t>The other email fields (Category Manager, In-Stock Manager, and their respective AD emails) are maintained for visibility and downstream use.</w:t>
+      </w:r>
+    </w:p>
+    <w:p>
+      <w:pPr>
+        <w:pStyle w:val="ListBullet"/>
+      </w:pPr>
+      <w:r>
+        <w:t xml:space="preserve">All email fields accept multiple addresses in </w:t>
+      </w:r>
+      <w:r>
+        <w:rPr>
+          <w:b/>
+          <w:bCs/>
+        </w:rPr>
+        <w:t>semicolon-separated</w:t>
+      </w:r>
+      <w:r>
+        <w:t xml:space="preserve"> format: </w:t>
+      </w:r>
+      <w:proofErr w:type="gramStart"/>
+      <w:r>
+        <w:t>`first@chewy.com;second@chewy.com</w:t>
+      </w:r>
+      <w:proofErr w:type="gramEnd"/>
+      <w:r>
+        <w:t>`</w:t>
+      </w:r>
+    </w:p>
+    <w:p>
+      <w:pPr>
+        <w:pStyle w:val="Heading3"/>
+      </w:pPr>
+      <w:r>
+        <w:t>3.3 Making and confirming changes</w:t>
+      </w:r>
+    </w:p>
+    <w:p>
+      <w:pPr>
+        <w:spacing w:before="120" w:after="120" w:line="264" w:lineRule="auto"/>
+      </w:pPr>
+      <w:r>
+        <w:t>Edits follow a deliberate two-step flow to prevent accidental saves:</w:t>
+      </w:r>
+    </w:p>
+    <w:p>
+      <w:pPr>
+        <w:pStyle w:val="ListNumber"/>
+      </w:pPr>
+      <w:r>
+        <w:t>Open a vendor record from search or the table view and make your changes.</w:t>
+      </w:r>
+    </w:p>
+    <w:p>
+      <w:pPr>
+        <w:pStyle w:val="ListNumber"/>
+      </w:pPr>
+      <w:r>
+        <w:t xml:space="preserve">Click </w:t>
+      </w:r>
+      <w:r>
+        <w:rPr>
+          <w:b/>
+          <w:bCs/>
+        </w:rPr>
+        <w:t>Save Changes</w:t>
+      </w:r>
+      <w:r>
+        <w:t xml:space="preserve"> -- nothing is written yet. The app shows a </w:t>
+      </w:r>
+      <w:r>
+        <w:rPr>
+          <w:b/>
+          <w:bCs/>
+        </w:rPr>
+        <w:t>Changes Summary</w:t>
+      </w:r>
+      <w:r>
+        <w:t xml:space="preserve"> listing every field with its old and new value. The tool will also perform business logic and formatting checks at this time.</w:t>
+      </w:r>
+    </w:p>
+    <w:p>
+      <w:pPr>
+        <w:pStyle w:val="ListNumber"/>
+      </w:pPr>
+      <w:r>
+        <w:t xml:space="preserve">Review the summary, then click </w:t>
+      </w:r>
+      <w:r>
+        <w:rPr>
+          <w:b/>
+          <w:bCs/>
+        </w:rPr>
+        <w:t>Confirm Changes</w:t>
+      </w:r>
+      <w:r>
+        <w:t xml:space="preserve"> to save, or </w:t>
+      </w:r>
+      <w:r>
+        <w:rPr>
+          <w:b/>
+          <w:bCs/>
+        </w:rPr>
+        <w:t>Cancel Changes</w:t>
+      </w:r>
+      <w:r>
+        <w:t xml:space="preserve"> to discard.</w:t>
+      </w:r>
+    </w:p>
+    <w:p>
+      <w:pPr>
+        <w:pStyle w:val="ListNumber"/>
+      </w:pPr>
+      <w:r>
+        <w:t xml:space="preserve">A </w:t>
+      </w:r>
+      <w:r>
+        <w:rPr>
+          <w:b/>
+          <w:bCs/>
+        </w:rPr>
+        <w:t>receipt</w:t>
+      </w:r>
+      <w:r>
+        <w:t xml:space="preserve"> screen appears after a successful save. It shows exactly what changed and the record's current state. This is your best opportunity to catch something wrong before you move on -- if you spot an error, you can go right back and make another edit.</w:t>
+      </w:r>
+    </w:p>
+    <w:p>
+      <w:pPr>
+        <w:spacing w:before="120" w:after="120" w:line="264" w:lineRule="auto"/>
+      </w:pPr>
+      <w:r>
+        <w:t>Adding a new vendor works similarly but completes on a single screen with an inline confirmation rather than a separate receipt.</w:t>
+      </w:r>
+    </w:p>
+    <w:p>
+      <w:pPr>
+        <w:pStyle w:val="Heading2"/>
+      </w:pPr>
+      <w:r>
+        <w:t>4. Search: Find a specific vendor</w:t>
+      </w:r>
+    </w:p>
+    <w:p>
+      <w:pPr>
+        <w:spacing w:before="120" w:after="120" w:line="264" w:lineRule="auto"/>
+      </w:pPr>
+      <w:r>
+        <w:t xml:space="preserve">From the </w:t>
+      </w:r>
+      <w:r>
+        <w:rPr>
+          <w:b/>
+          <w:bCs/>
+        </w:rPr>
+        <w:t>Search</w:t>
+      </w:r>
+      <w:r>
+        <w:t xml:space="preserve"> screen, choose how you want to look up the vendor:</w:t>
+      </w:r>
+    </w:p>
+    <w:p>
+      <w:pPr>
+        <w:pStyle w:val="ListBullet"/>
+      </w:pPr>
+      <w:r>
+        <w:rPr>
+          <w:b/>
+          <w:bCs/>
+        </w:rPr>
+        <w:t>Vendor Number</w:t>
+      </w:r>
+      <w:r>
+        <w:t xml:space="preserve"> -- exact, case-sensitive match. Type the full vendor number as it is stored.</w:t>
+      </w:r>
+    </w:p>
+    <w:p>
+      <w:pPr>
+        <w:pStyle w:val="ListBullet"/>
+      </w:pPr>
+      <w:r>
+        <w:rPr>
+          <w:b/>
+          <w:bCs/>
+        </w:rPr>
+        <w:t>Vendor Name</w:t>
+      </w:r>
+      <w:r>
+        <w:t xml:space="preserve">, </w:t>
+      </w:r>
+      <w:r>
+        <w:rPr>
+          <w:b/>
+          <w:bCs/>
+        </w:rPr>
+        <w:t>Parent Company</w:t>
+      </w:r>
+      <w:r>
+        <w:t xml:space="preserve">, </w:t>
+      </w:r>
+      <w:r>
+        <w:rPr>
+          <w:b/>
+          <w:bCs/>
+        </w:rPr>
+        <w:t>Vendor Contacts</w:t>
+      </w:r>
+      <w:r>
+        <w:t xml:space="preserve"> -- partial, case-insensitive match. Any fragment works.</w:t>
+      </w:r>
+    </w:p>
+    <w:p>
+      <w:pPr>
+        <w:spacing w:before="120" w:after="120" w:line="264" w:lineRule="auto"/>
+      </w:pPr>
+      <w:r>
+        <w:t xml:space="preserve">Enter your term and click </w:t>
+      </w:r>
+      <w:r>
+        <w:rPr>
+          <w:b/>
+          <w:bCs/>
+        </w:rPr>
+        <w:t>Search</w:t>
+      </w:r>
+      <w:r>
+        <w:t xml:space="preserve">. Results show the vendor number, name, and Tier for each matching record. Click </w:t>
+      </w:r>
+      <w:r>
+        <w:rPr>
+          <w:b/>
+          <w:bCs/>
+        </w:rPr>
+        <w:t>Edit</w:t>
+      </w:r>
+      <w:r>
+        <w:t xml:space="preserve"> on the record you want to open.</w:t>
+      </w:r>
+    </w:p>
+    <w:p>
+      <w:pPr>
+        <w:spacing w:before="120" w:after="120" w:line="264" w:lineRule="auto"/>
+      </w:pPr>
+      <w:r>
+        <w:rPr>
+          <w:b/>
+          <w:bCs/>
+        </w:rPr>
+        <w:t>When you see duplicate labels:</w:t>
+      </w:r>
+      <w:r>
+        <w:t xml:space="preserve"> If a vendor number has more than one record, the lower-priority rows are tagged `(duplicate)` or similar. Pick the record with the Tier you intend to edit</w:t>
+      </w:r>
+      <w:r>
+        <w:t>;</w:t>
+      </w:r>
+      <w:r>
+        <w:t xml:space="preserve"> flag the duplication to CPFR if cleanup is needed.</w:t>
+      </w:r>
+    </w:p>
+    <w:p>
+      <w:pPr>
+        <w:spacing w:before="120" w:after="120" w:line="264" w:lineRule="auto"/>
+      </w:pPr>
+      <w:r>
+        <w:rPr>
+          <w:b/>
+          <w:bCs/>
+        </w:rPr>
+        <w:t>Back to Search</w:t>
+      </w:r>
+      <w:r>
+        <w:t xml:space="preserve"> returns you to the search screen and clears the result list.</w:t>
+      </w:r>
+    </w:p>
+    <w:p>
+      <w:pPr>
+        <w:pStyle w:val="Heading2"/>
+      </w:pPr>
+      <w:r>
+        <w:t>5. Table view: Browse and filter all vendors</w:t>
+      </w:r>
+    </w:p>
+    <w:p>
+      <w:pPr>
+        <w:pStyle w:val="ListBullet"/>
+      </w:pPr>
+      <w:r>
+        <w:t xml:space="preserve">Click </w:t>
+      </w:r>
+      <w:r>
+        <w:rPr>
+          <w:b/>
+          <w:bCs/>
+        </w:rPr>
+        <w:t>View full table</w:t>
+      </w:r>
+      <w:r>
+        <w:t xml:space="preserve"> from Search to load every vendor record into a sortable, filterable grid.</w:t>
+      </w:r>
+    </w:p>
+    <w:p>
+      <w:pPr>
+        <w:pStyle w:val="ListBullet"/>
+      </w:pPr>
+      <w:r>
+        <w:rPr>
+          <w:b/>
+          <w:bCs/>
+        </w:rPr>
+        <w:t>Filtering:</w:t>
+      </w:r>
+      <w:r>
+        <w:t xml:space="preserve"> Expand </w:t>
+      </w:r>
+      <w:r>
+        <w:rPr>
+          <w:b/>
+          <w:bCs/>
+        </w:rPr>
+        <w:t>Filters</w:t>
+      </w:r>
+      <w:r>
+        <w:t xml:space="preserve"> to narrow the list. Type a partial value in any column's text box, or select from the </w:t>
+      </w:r>
+      <w:r>
+        <w:rPr>
+          <w:b/>
+          <w:bCs/>
+        </w:rPr>
+        <w:t>FILE</w:t>
+      </w:r>
+      <w:r>
+        <w:t xml:space="preserve"> multiselect. Filters stack -- every field you fill in narrows the results further, so you can, for example, show only Tier2 records whose vendor name contains "Pet" at the same time.</w:t>
+      </w:r>
+    </w:p>
+    <w:p>
+      <w:pPr>
+        <w:pStyle w:val="ListBullet"/>
+      </w:pPr>
+      <w:r>
+        <w:rPr>
+          <w:b/>
+          <w:bCs/>
+        </w:rPr>
+        <w:t>Opening a record:</w:t>
+      </w:r>
+      <w:r>
+        <w:t xml:space="preserve"> Click any row in the grid to open it directly in the editor.</w:t>
+      </w:r>
+    </w:p>
+    <w:p>
+      <w:pPr>
+        <w:pStyle w:val="ListBullet"/>
+      </w:pPr>
+      <w:r>
+        <w:rPr>
+          <w:b/>
+          <w:bCs/>
+        </w:rPr>
+        <w:t>Sorting:</w:t>
+      </w:r>
+      <w:r>
+        <w:t xml:space="preserve"> Click any column header to sort by that column.</w:t>
+      </w:r>
+    </w:p>
+    <w:p>
+      <w:pPr>
+        <w:pStyle w:val="ListBullet"/>
+      </w:pPr>
+      <w:r>
+        <w:rPr>
+          <w:b/>
+          <w:bCs/>
+        </w:rPr>
+        <w:t>After saving changes:</w:t>
+      </w:r>
+      <w:r>
+        <w:t xml:space="preserve"> The table does not auto-refresh. Click </w:t>
+      </w:r>
+      <w:r>
+        <w:rPr>
+          <w:b/>
+          <w:bCs/>
+        </w:rPr>
+        <w:t>Refresh data</w:t>
+      </w:r>
+      <w:r>
+        <w:t xml:space="preserve"> to pull the latest values from the database.</w:t>
+      </w:r>
+    </w:p>
+    <w:p>
+      <w:pPr>
+        <w:pStyle w:val="ListBullet"/>
+      </w:pPr>
+      <w:r>
+        <w:t>Filter settings are preserved when you leave to edit a record and come back, so you can continue working the same narrowed view.</w:t>
+      </w:r>
+    </w:p>
+    <w:p>
+      <w:pPr>
+        <w:pStyle w:val="ListBullet"/>
+      </w:pPr>
+      <w:r>
+        <w:rPr>
+          <w:b/>
+          <w:bCs/>
+        </w:rPr>
+        <w:t>Back to Search</w:t>
+      </w:r>
+      <w:r>
+        <w:t xml:space="preserve"> clears filters and returns to the search screen.</w:t>
+      </w:r>
+    </w:p>
+    <w:p>
+      <w:pPr>
+        <w:rPr>
+          <w:b/>
+          <w:bCs/>
+          <w:color w:val="000000"/>
+          <w:sz w:val="28"/>
+          <w:szCs w:val="28"/>
+        </w:rPr>
+      </w:pPr>
+      <w:r>
+        <w:br w:type="page"/>
+      </w:r>
+    </w:p>
+    <w:p>
+      <w:pPr>
+        <w:pStyle w:val="Heading2"/>
+      </w:pPr>
       <w:r>
         <w:lastRenderedPageBreak/>
-        <w:t>contacts, or to ensure no external recipients. This field is not modified during standard updates, including batch updates.</w:t>
+        <w:t>6. Edit a vendor record</w:t>
+      </w:r>
+    </w:p>
+    <w:p>
+      <w:pPr>
+        <w:spacing w:before="120" w:after="120" w:line="264" w:lineRule="auto"/>
+      </w:pPr>
+      <w:r>
+        <w:t>Open the editor from a search result or from the table view. The record reload</w:t>
+      </w:r>
+      <w:r>
+        <w:t>s</w:t>
+      </w:r>
+      <w:r>
+        <w:t xml:space="preserve"> fresh from the database when you open it.</w:t>
+      </w:r>
+    </w:p>
+    <w:p>
+      <w:pPr>
+        <w:pStyle w:val="Heading3"/>
+      </w:pPr>
+      <w:r>
+        <w:t>6.1 Editable fields</w:t>
+      </w:r>
+    </w:p>
+    <w:p>
+      <w:pPr>
+        <w:spacing w:before="120" w:after="120" w:line="264" w:lineRule="auto"/>
+      </w:pPr>
+      <w:r>
+        <w:t xml:space="preserve">The following fields can be edited. </w:t>
+      </w:r>
+      <w:r>
+        <w:rPr>
+          <w:b/>
+          <w:bCs/>
+        </w:rPr>
+        <w:t>Vendor Number</w:t>
+      </w:r>
+      <w:r>
+        <w:t xml:space="preserve"> is not editable -- it identifies the record.</w:t>
       </w:r>
     </w:p>
     <w:p>
@@ -850,7 +1303,7 @@
         <w:pStyle w:val="ListBullet"/>
       </w:pPr>
       <w:r>
-        <w:t>The other email fields (Category Manager, In-Stock Manager, and their respective AD emails) are maintained for visibility and downstream use.</w:t>
+        <w:t>Vendor Name</w:t>
       </w:r>
     </w:p>
     <w:p>
@@ -858,487 +1311,7 @@
         <w:pStyle w:val="ListBullet"/>
       </w:pPr>
       <w:r>
-        <w:t xml:space="preserve">All email fields accept multiple addresses in </w:t>
-      </w:r>
-      <w:r>
-        <w:rPr>
-          <w:b/>
-          <w:bCs/>
-        </w:rPr>
-        <w:t>semicolon-separated</w:t>
-      </w:r>
-      <w:r>
-        <w:t xml:space="preserve"> format: </w:t>
-      </w:r>
-      <w:proofErr w:type="gramStart"/>
-      <w:r>
-        <w:t>`first@chewy.com;second@chewy.com</w:t>
-      </w:r>
-      <w:proofErr w:type="gramEnd"/>
-      <w:r>
-        <w:t>`</w:t>
-      </w:r>
-    </w:p>
-    <w:p>
-      <w:pPr>
-        <w:pStyle w:val="Heading3"/>
-      </w:pPr>
-      <w:r>
-        <w:t>3</w:t>
-      </w:r>
-      <w:r>
-        <w:t>.3 Making and confirming changes</w:t>
-      </w:r>
-    </w:p>
-    <w:p>
-      <w:pPr>
-        <w:spacing w:before="120" w:after="120" w:line="264" w:lineRule="auto"/>
-      </w:pPr>
-      <w:r>
-        <w:t>Edits follow a deliberate two-step flow to prevent accidental saves:</w:t>
-      </w:r>
-    </w:p>
-    <w:p>
-      <w:pPr>
-        <w:pStyle w:val="ListNumber"/>
-      </w:pPr>
-      <w:r>
-        <w:t>Open a vendor record from search or the table view and make your changes.</w:t>
-      </w:r>
-    </w:p>
-    <w:p>
-      <w:pPr>
-        <w:pStyle w:val="ListNumber"/>
-      </w:pPr>
-      <w:r>
-        <w:t xml:space="preserve">Click </w:t>
-      </w:r>
-      <w:r>
-        <w:rPr>
-          <w:b/>
-          <w:bCs/>
-        </w:rPr>
-        <w:t>Save Changes</w:t>
-      </w:r>
-      <w:r>
-        <w:t xml:space="preserve"> -- nothing is written yet. The app shows a </w:t>
-      </w:r>
-      <w:r>
-        <w:rPr>
-          <w:b/>
-          <w:bCs/>
-        </w:rPr>
-        <w:t>Changes Summary</w:t>
-      </w:r>
-      <w:r>
-        <w:t xml:space="preserve"> listing every field with its old and new value. The tool will also perform business logic and formatting checks at this time.</w:t>
-      </w:r>
-    </w:p>
-    <w:p>
-      <w:pPr>
-        <w:pStyle w:val="ListNumber"/>
-      </w:pPr>
-      <w:r>
-        <w:t xml:space="preserve">Review the summary, then click </w:t>
-      </w:r>
-      <w:r>
-        <w:rPr>
-          <w:b/>
-          <w:bCs/>
-        </w:rPr>
-        <w:t>Confirm Changes</w:t>
-      </w:r>
-      <w:r>
-        <w:t xml:space="preserve"> to save, or </w:t>
-      </w:r>
-      <w:r>
-        <w:rPr>
-          <w:b/>
-          <w:bCs/>
-        </w:rPr>
-        <w:t>Cancel Changes</w:t>
-      </w:r>
-      <w:r>
-        <w:t xml:space="preserve"> to discard.</w:t>
-      </w:r>
-    </w:p>
-    <w:p>
-      <w:pPr>
-        <w:pStyle w:val="ListNumber"/>
-      </w:pPr>
-      <w:r>
-        <w:t xml:space="preserve">A </w:t>
-      </w:r>
-      <w:r>
-        <w:rPr>
-          <w:b/>
-          <w:bCs/>
-        </w:rPr>
-        <w:t>receipt</w:t>
-      </w:r>
-      <w:r>
-        <w:t xml:space="preserve"> screen appears after a successful save. It shows exactly what changed and the record's current state. This is your best opportunity to catch something wrong before you move on -- if you spot an error, you can go right back and make another edit.</w:t>
-      </w:r>
-    </w:p>
-    <w:p>
-      <w:pPr>
-        <w:spacing w:before="120" w:after="120" w:line="264" w:lineRule="auto"/>
-      </w:pPr>
-      <w:r>
-        <w:t>A</w:t>
-      </w:r>
-      <w:r>
-        <w:t>dding a new vendor works similarly but completes on a single screen with an inline confirmation rather than a separate receipt.</w:t>
-      </w:r>
-    </w:p>
-    <w:p>
-      <w:pPr>
-        <w:pStyle w:val="Heading2"/>
-      </w:pPr>
-      <w:r>
-        <w:t>4. Search: Find a specific vendor</w:t>
-      </w:r>
-    </w:p>
-    <w:p>
-      <w:pPr>
-        <w:spacing w:before="120" w:after="120" w:line="264" w:lineRule="auto"/>
-      </w:pPr>
-      <w:r>
-        <w:t xml:space="preserve">From the </w:t>
-      </w:r>
-      <w:r>
-        <w:rPr>
-          <w:b/>
-          <w:bCs/>
-        </w:rPr>
-        <w:t>Search</w:t>
-      </w:r>
-      <w:r>
-        <w:t xml:space="preserve"> screen, choose how you want to look up the vendor:</w:t>
-      </w:r>
-    </w:p>
-    <w:p>
-      <w:pPr>
-        <w:pStyle w:val="ListBullet"/>
-      </w:pPr>
-      <w:r>
-        <w:rPr>
-          <w:b/>
-          <w:bCs/>
-        </w:rPr>
-        <w:t>Vendor Number</w:t>
-      </w:r>
-      <w:r>
-        <w:t xml:space="preserve"> -- exact, case-sensitive match. Type the full vendor number as it is stored.</w:t>
-      </w:r>
-    </w:p>
-    <w:p>
-      <w:pPr>
-        <w:pStyle w:val="ListBullet"/>
-      </w:pPr>
-      <w:r>
-        <w:rPr>
-          <w:b/>
-          <w:bCs/>
-        </w:rPr>
-        <w:t>Vendor Name</w:t>
-      </w:r>
-      <w:r>
-        <w:t xml:space="preserve">, </w:t>
-      </w:r>
-      <w:r>
-        <w:rPr>
-          <w:b/>
-          <w:bCs/>
-        </w:rPr>
-        <w:t>Parent Company</w:t>
-      </w:r>
-      <w:r>
-        <w:t xml:space="preserve">, </w:t>
-      </w:r>
-      <w:r>
-        <w:rPr>
-          <w:b/>
-          <w:bCs/>
-        </w:rPr>
-        <w:t>Vendor Contacts</w:t>
-      </w:r>
-      <w:r>
-        <w:t xml:space="preserve"> -- partial, case-insensitive match. Any fragment works.</w:t>
-      </w:r>
-    </w:p>
-    <w:p>
-      <w:pPr>
-        <w:spacing w:before="120" w:after="120" w:line="264" w:lineRule="auto"/>
-      </w:pPr>
-      <w:r>
-        <w:t xml:space="preserve">Enter your term and click </w:t>
-      </w:r>
-      <w:r>
-        <w:rPr>
-          <w:b/>
-          <w:bCs/>
-        </w:rPr>
-        <w:t>Search</w:t>
-      </w:r>
-      <w:r>
-        <w:t xml:space="preserve">. Results show the vendor number, name, and Tier for each matching record. Click </w:t>
-      </w:r>
-      <w:r>
-        <w:rPr>
-          <w:b/>
-          <w:bCs/>
-        </w:rPr>
-        <w:t>Edit</w:t>
-      </w:r>
-      <w:r>
-        <w:t xml:space="preserve"> on the record you want to open.</w:t>
-      </w:r>
-    </w:p>
-    <w:p>
-      <w:pPr>
-        <w:spacing w:before="120" w:after="120" w:line="264" w:lineRule="auto"/>
-      </w:pPr>
-      <w:r>
-        <w:rPr>
-          <w:b/>
-          <w:bCs/>
-        </w:rPr>
-        <w:t>When you see duplicate labels:</w:t>
-      </w:r>
-      <w:r>
-        <w:t xml:space="preserve"> If a vendor number has more than one record, the lower-priority rows are tagged `(duplicate)` or similar. Pick the record with the Tier you intend to edit</w:t>
-      </w:r>
-      <w:r>
-        <w:t>;</w:t>
-      </w:r>
-      <w:r>
-        <w:t xml:space="preserve"> flag the duplication to CPFR if cleanup is needed.</w:t>
-      </w:r>
-    </w:p>
-    <w:p>
-      <w:pPr>
-        <w:spacing w:before="120" w:after="120" w:line="264" w:lineRule="auto"/>
-      </w:pPr>
-      <w:r>
-        <w:rPr>
-          <w:b/>
-          <w:bCs/>
-        </w:rPr>
-        <w:t>Back to Search</w:t>
-      </w:r>
-      <w:r>
-        <w:t xml:space="preserve"> returns you to the search screen and clears the result list.</w:t>
-      </w:r>
-    </w:p>
-    <w:p>
-      <w:pPr>
-        <w:pStyle w:val="Heading2"/>
-      </w:pPr>
-      <w:r>
-        <w:t>5. Table view: Browse and filter all vendors</w:t>
-      </w:r>
-    </w:p>
-    <w:p>
-      <w:pPr>
-        <w:pStyle w:val="ListBullet"/>
-      </w:pPr>
-      <w:r>
-        <w:t xml:space="preserve">Click </w:t>
-      </w:r>
-      <w:r>
-        <w:rPr>
-          <w:b/>
-          <w:bCs/>
-        </w:rPr>
-        <w:t>View full table</w:t>
-      </w:r>
-      <w:r>
-        <w:t xml:space="preserve"> from Search to load every vendor record into a sortable, filterable grid.</w:t>
-      </w:r>
-    </w:p>
-    <w:p>
-      <w:pPr>
-        <w:pStyle w:val="ListBullet"/>
-      </w:pPr>
-      <w:r>
-        <w:rPr>
-          <w:b/>
-          <w:bCs/>
-        </w:rPr>
-        <w:t>Filtering:</w:t>
-      </w:r>
-      <w:r>
-        <w:t xml:space="preserve"> Expand </w:t>
-      </w:r>
-      <w:r>
-        <w:rPr>
-          <w:b/>
-          <w:bCs/>
-        </w:rPr>
-        <w:t>Filters</w:t>
-      </w:r>
-      <w:r>
-        <w:t xml:space="preserve"> to narrow the list. Type a partial value in any column's text box, or select from the </w:t>
-      </w:r>
-      <w:r>
-        <w:rPr>
-          <w:b/>
-          <w:bCs/>
-        </w:rPr>
-        <w:t>FILE</w:t>
-      </w:r>
-      <w:r>
-        <w:t xml:space="preserve"> multiselect. Filters stack -- every field you fill in narrows the results further, so you can, for example, show only Tier2 records whose vendor name contains "Pet" at the same time.</w:t>
-      </w:r>
-    </w:p>
-    <w:p>
-      <w:pPr>
-        <w:pStyle w:val="ListBullet"/>
-      </w:pPr>
-      <w:r>
-        <w:rPr>
-          <w:b/>
-          <w:bCs/>
-        </w:rPr>
-        <w:t>Opening a record:</w:t>
-      </w:r>
-      <w:r>
-        <w:t xml:space="preserve"> Click any row in the grid to open it directly in the editor.</w:t>
-      </w:r>
-    </w:p>
-    <w:p>
-      <w:pPr>
-        <w:pStyle w:val="ListBullet"/>
-      </w:pPr>
-      <w:r>
-        <w:rPr>
-          <w:b/>
-          <w:bCs/>
-        </w:rPr>
-        <w:t>Sorting:</w:t>
-      </w:r>
-      <w:r>
-        <w:t xml:space="preserve"> Click any column header to sort by that column.</w:t>
-      </w:r>
-    </w:p>
-    <w:p>
-      <w:pPr>
-        <w:pStyle w:val="ListBullet"/>
-      </w:pPr>
-      <w:r>
-        <w:rPr>
-          <w:b/>
-          <w:bCs/>
-        </w:rPr>
-        <w:t>After saving changes:</w:t>
-      </w:r>
-      <w:r>
-        <w:t xml:space="preserve"> The table does not auto-refresh. Click </w:t>
-      </w:r>
-      <w:r>
-        <w:rPr>
-          <w:b/>
-          <w:bCs/>
-        </w:rPr>
-        <w:t>Refresh data</w:t>
-      </w:r>
-      <w:r>
-        <w:t xml:space="preserve"> to pull the latest values from the database.</w:t>
-      </w:r>
-    </w:p>
-    <w:p>
-      <w:pPr>
-        <w:pStyle w:val="ListBullet"/>
-      </w:pPr>
-      <w:r>
-        <w:t>Filter settings are preserved when you leave to edit a record and come back, so you can continue working the same narrowed view.</w:t>
-      </w:r>
-    </w:p>
-    <w:p>
-      <w:pPr>
-        <w:pStyle w:val="ListBullet"/>
-      </w:pPr>
-      <w:r>
-        <w:rPr>
-          <w:b/>
-          <w:bCs/>
-        </w:rPr>
-        <w:t>Back to Search</w:t>
-      </w:r>
-      <w:r>
-        <w:t xml:space="preserve"> clears filters and returns to the search screen.</w:t>
-      </w:r>
-    </w:p>
-    <w:p>
-      <w:pPr>
-        <w:pStyle w:val="Heading2"/>
-      </w:pPr>
-      <w:r>
-        <w:t>6. Edit a vendor record</w:t>
-      </w:r>
-    </w:p>
-    <w:p>
-      <w:pPr>
-        <w:spacing w:before="120" w:after="120" w:line="264" w:lineRule="auto"/>
-      </w:pPr>
-      <w:r>
-        <w:t xml:space="preserve">Open the editor from a search result or from the table view. The record </w:t>
-      </w:r>
-      <w:r>
-        <w:t>reload</w:t>
-      </w:r>
-      <w:r>
-        <w:t>s</w:t>
-      </w:r>
-      <w:r>
-        <w:t xml:space="preserve"> fresh from the database when you open it.</w:t>
-      </w:r>
-    </w:p>
-    <w:p>
-      <w:pPr>
-        <w:pStyle w:val="Heading3"/>
-      </w:pPr>
-      <w:r>
-        <w:t>6.1 Editable fields</w:t>
-      </w:r>
-    </w:p>
-    <w:p>
-      <w:pPr>
-        <w:spacing w:before="120" w:after="120" w:line="264" w:lineRule="auto"/>
-      </w:pPr>
-      <w:r>
-        <w:t xml:space="preserve">The following fields can be edited. </w:t>
-      </w:r>
-      <w:r>
-        <w:rPr>
-          <w:b/>
-          <w:bCs/>
-        </w:rPr>
-        <w:t>Vendor Number</w:t>
-      </w:r>
-      <w:r>
-        <w:t xml:space="preserve"> is not editable -- it identifies the record.</w:t>
-      </w:r>
-    </w:p>
-    <w:p>
-      <w:pPr>
-        <w:pStyle w:val="ListBullet"/>
-      </w:pPr>
-      <w:r>
-        <w:lastRenderedPageBreak/>
-        <w:t>Vendor Name</w:t>
-      </w:r>
-    </w:p>
-    <w:p>
-      <w:pPr>
-        <w:pStyle w:val="ListBullet"/>
-      </w:pPr>
-      <w:r>
-        <w:t>Vendor Contacts</w:t>
-      </w:r>
-      <w:r>
-        <w:t xml:space="preserve"> *(required; semicolon-separated </w:t>
+        <w:t xml:space="preserve">Vendor Contacts *(required; semicolon-separated </w:t>
       </w:r>
       <w:proofErr w:type="gramStart"/>
       <w:r>
@@ -1560,10 +1533,7 @@
         <w:pStyle w:val="Heading2"/>
       </w:pPr>
       <w:r>
-        <w:t>7</w:t>
-      </w:r>
-      <w:r>
-        <w:t>. Add a new vendor</w:t>
+        <w:t>7. Add a new vendor</w:t>
       </w:r>
     </w:p>
     <w:p>
@@ -1756,10 +1726,21 @@
         <w:spacing w:before="120" w:after="120" w:line="264" w:lineRule="auto"/>
       </w:pPr>
       <w:r>
-        <w:t>T</w:t>
-      </w:r>
-      <w:r>
-        <w:t>he exact-match search requirement in step 1 is intentional: it ensures the vendor number does not already exist under that precise identifier before any new data is created. This prevents records like P12345 and B12345 from being confused, and catches partial or abbreviated numbers before they become permanent.</w:t>
+        <w:t>The exact-match search requirement in step 1 is intentional: it ensures the vendor number does not already exist under that precise identifier before any new data is created. This prevents records like P12345 and B12345 from being confused, and catches partial or abbreviated numbers before they become permanent.</w:t>
+      </w:r>
+    </w:p>
+    <w:p>
+      <w:pPr>
+        <w:rPr>
+          <w:b/>
+          <w:bCs/>
+          <w:color w:val="000000"/>
+          <w:sz w:val="28"/>
+          <w:szCs w:val="28"/>
+        </w:rPr>
+      </w:pPr>
+      <w:r>
+        <w:br w:type="page"/>
       </w:r>
     </w:p>
     <w:p>
@@ -1767,6 +1748,7 @@
         <w:pStyle w:val="Heading2"/>
       </w:pPr>
       <w:r>
+        <w:lastRenderedPageBreak/>
         <w:t>8. Built-in guardrails</w:t>
       </w:r>
     </w:p>
@@ -1847,7 +1829,6 @@
           <w:b/>
           <w:bCs/>
         </w:rPr>
-        <w:lastRenderedPageBreak/>
         <w:t>Two-step save:</w:t>
       </w:r>
       <w:r>
@@ -1897,7 +1878,19 @@
         <w:t>If you make a mistake:</w:t>
       </w:r>
       <w:r>
-        <w:t xml:space="preserve"> If you know what went wrong and what the correct value is, simply edit the record again. The tool supports as many corrections as you need. Contact CPFR when you are unsure what was changed, cannot determine the correct state, or want someone to verify the history before you act. CPFR can review the log and, if needed, restore a prior state -- but that escalation is for the unclear cases, not every error.</w:t>
+        <w:t xml:space="preserve"> If you know what went wrong and what the correct value is, </w:t>
+      </w:r>
+      <w:r>
+        <w:t xml:space="preserve">you may </w:t>
+      </w:r>
+      <w:r>
+        <w:t xml:space="preserve">simply edit the record again. The tool supports as many corrections as you need. Contact CPFR when you are unsure what was changed, cannot determine the correct state, or want someone to verify the history before you act. CPFR </w:t>
+      </w:r>
+      <w:r>
+        <w:t xml:space="preserve">team </w:t>
+      </w:r>
+      <w:r>
+        <w:t>can review the log and, if needed, restore a prior state -- but that escalation is for the unclear cases, not every error.</w:t>
       </w:r>
     </w:p>
     <w:p>
@@ -1926,19 +1919,13 @@
         <w:tblLook w:val="04A0" w:firstRow="1" w:lastRow="0" w:firstColumn="1" w:lastColumn="0" w:noHBand="0" w:noVBand="1"/>
       </w:tblPr>
       <w:tblGrid>
-        <w:gridCol w:w="5256"/>
-        <w:gridCol w:w="5256"/>
+        <w:gridCol w:w="2155"/>
+        <w:gridCol w:w="8357"/>
       </w:tblGrid>
       <w:tr>
-        <w:tblPrEx>
-          <w:tblCellMar>
-            <w:top w:w="0" w:type="dxa"/>
-            <w:bottom w:w="0" w:type="dxa"/>
-          </w:tblCellMar>
-        </w:tblPrEx>
         <w:tc>
           <w:tcPr>
-            <w:tcW w:w="5256" w:type="dxa"/>
+            <w:tcW w:w="2155" w:type="dxa"/>
             <w:tcBorders>
               <w:top w:val="single" w:sz="4" w:space="0" w:color="BFBFBF"/>
               <w:left w:val="single" w:sz="4" w:space="0" w:color="BFBFBF"/>
@@ -1968,7 +1955,7 @@
         </w:tc>
         <w:tc>
           <w:tcPr>
-            <w:tcW w:w="5256" w:type="dxa"/>
+            <w:tcW w:w="8357" w:type="dxa"/>
             <w:tcBorders>
               <w:top w:val="single" w:sz="4" w:space="0" w:color="BFBFBF"/>
               <w:left w:val="single" w:sz="4" w:space="0" w:color="BFBFBF"/>
@@ -1998,15 +1985,9 @@
         </w:tc>
       </w:tr>
       <w:tr>
-        <w:tblPrEx>
-          <w:tblCellMar>
-            <w:top w:w="0" w:type="dxa"/>
-            <w:bottom w:w="0" w:type="dxa"/>
-          </w:tblCellMar>
-        </w:tblPrEx>
         <w:tc>
           <w:tcPr>
-            <w:tcW w:w="5256" w:type="dxa"/>
+            <w:tcW w:w="2155" w:type="dxa"/>
             <w:tcBorders>
               <w:top w:val="single" w:sz="4" w:space="0" w:color="BFBFBF"/>
               <w:left w:val="single" w:sz="4" w:space="0" w:color="BFBFBF"/>
@@ -2031,7 +2012,7 @@
         </w:tc>
         <w:tc>
           <w:tcPr>
-            <w:tcW w:w="5256" w:type="dxa"/>
+            <w:tcW w:w="8357" w:type="dxa"/>
             <w:tcBorders>
               <w:top w:val="single" w:sz="4" w:space="0" w:color="BFBFBF"/>
               <w:left w:val="single" w:sz="4" w:space="0" w:color="BFBFBF"/>
@@ -2050,7 +2031,25 @@
               <w:pStyle w:val="BodyText2"/>
             </w:pPr>
             <w:r>
-              <w:t xml:space="preserve">Verify your Snowflake session is </w:t>
+              <w:t>The tool may require up to 30 seconds to come on</w:t>
+            </w:r>
+            <w:r>
+              <w:t>-</w:t>
+            </w:r>
+            <w:r>
+              <w:t>line.</w:t>
+            </w:r>
+            <w:r>
+              <w:t xml:space="preserve"> The search button will turn blue when the tool has finished loading and is ready for use.</w:t>
+            </w:r>
+            <w:r>
+              <w:t xml:space="preserve"> </w:t>
+            </w:r>
+            <w:r>
+              <w:t>If you still experience issues, v</w:t>
+            </w:r>
+            <w:r>
+              <w:t xml:space="preserve">erify your Snowflake session is </w:t>
             </w:r>
             <w:proofErr w:type="gramStart"/>
             <w:r>
@@ -2064,15 +2063,9 @@
         </w:tc>
       </w:tr>
       <w:tr>
-        <w:tblPrEx>
-          <w:tblCellMar>
-            <w:top w:w="0" w:type="dxa"/>
-            <w:bottom w:w="0" w:type="dxa"/>
-          </w:tblCellMar>
-        </w:tblPrEx>
         <w:tc>
           <w:tcPr>
-            <w:tcW w:w="5256" w:type="dxa"/>
+            <w:tcW w:w="2155" w:type="dxa"/>
             <w:tcBorders>
               <w:top w:val="single" w:sz="4" w:space="0" w:color="BFBFBF"/>
               <w:left w:val="single" w:sz="4" w:space="0" w:color="BFBFBF"/>
@@ -2091,13 +2084,13 @@
               <w:pStyle w:val="BodyText2"/>
             </w:pPr>
             <w:r>
-              <w:t>Search returns no results</w:t>
+              <w:t>Tool loads but errors on searches or edits</w:t>
             </w:r>
           </w:p>
         </w:tc>
         <w:tc>
           <w:tcPr>
-            <w:tcW w:w="5256" w:type="dxa"/>
+            <w:tcW w:w="8357" w:type="dxa"/>
             <w:tcBorders>
               <w:top w:val="single" w:sz="4" w:space="0" w:color="BFBFBF"/>
               <w:left w:val="single" w:sz="4" w:space="0" w:color="BFBFBF"/>
@@ -2116,21 +2109,24 @@
               <w:pStyle w:val="BodyText2"/>
             </w:pPr>
             <w:r>
-              <w:t>For Vendor Number, confirm the exact string and capitalization. For other search types, try a shorter fragment.</w:t>
+              <w:t>Most CHAIN or Merch users will have authorization to search and make edits</w:t>
+            </w:r>
+            <w:r>
+              <w:t>;</w:t>
+            </w:r>
+            <w:r>
+              <w:t xml:space="preserve"> however, </w:t>
+            </w:r>
+            <w:r>
+              <w:t>misaligned Snowflake permissions may cause errors during operation—please reach out to CPFR team to investigate</w:t>
             </w:r>
           </w:p>
         </w:tc>
       </w:tr>
       <w:tr>
-        <w:tblPrEx>
-          <w:tblCellMar>
-            <w:top w:w="0" w:type="dxa"/>
-            <w:bottom w:w="0" w:type="dxa"/>
-          </w:tblCellMar>
-        </w:tblPrEx>
         <w:tc>
           <w:tcPr>
-            <w:tcW w:w="5256" w:type="dxa"/>
+            <w:tcW w:w="2155" w:type="dxa"/>
             <w:tcBorders>
               <w:top w:val="single" w:sz="4" w:space="0" w:color="BFBFBF"/>
               <w:left w:val="single" w:sz="4" w:space="0" w:color="BFBFBF"/>
@@ -2149,13 +2145,13 @@
               <w:pStyle w:val="BodyText2"/>
             </w:pPr>
             <w:r>
-              <w:t>Create New Entry does not appear</w:t>
+              <w:t>Search returns no results</w:t>
             </w:r>
           </w:p>
         </w:tc>
         <w:tc>
           <w:tcPr>
-            <w:tcW w:w="5256" w:type="dxa"/>
+            <w:tcW w:w="8357" w:type="dxa"/>
             <w:tcBorders>
               <w:top w:val="single" w:sz="4" w:space="0" w:color="BFBFBF"/>
               <w:left w:val="single" w:sz="4" w:space="0" w:color="BFBFBF"/>
@@ -2174,21 +2170,21 @@
               <w:pStyle w:val="BodyText2"/>
             </w:pPr>
             <w:r>
-              <w:t>Use Vendor Number search and run the search first. The button appears only after a zero-result search.</w:t>
+              <w:t xml:space="preserve">For Vendor Number, confirm the exact </w:t>
+            </w:r>
+            <w:r>
+              <w:t>text</w:t>
+            </w:r>
+            <w:r>
+              <w:t xml:space="preserve"> and capitalization. For other searches, try a shorter fragment.</w:t>
             </w:r>
           </w:p>
         </w:tc>
       </w:tr>
       <w:tr>
-        <w:tblPrEx>
-          <w:tblCellMar>
-            <w:top w:w="0" w:type="dxa"/>
-            <w:bottom w:w="0" w:type="dxa"/>
-          </w:tblCellMar>
-        </w:tblPrEx>
         <w:tc>
           <w:tcPr>
-            <w:tcW w:w="5256" w:type="dxa"/>
+            <w:tcW w:w="2155" w:type="dxa"/>
             <w:tcBorders>
               <w:top w:val="single" w:sz="4" w:space="0" w:color="BFBFBF"/>
               <w:left w:val="single" w:sz="4" w:space="0" w:color="BFBFBF"/>
@@ -2207,13 +2203,13 @@
               <w:pStyle w:val="BodyText2"/>
             </w:pPr>
             <w:r>
-              <w:t>Cannot select Tier1</w:t>
+              <w:t>Create New Entry does not appear</w:t>
             </w:r>
           </w:p>
         </w:tc>
         <w:tc>
           <w:tcPr>
-            <w:tcW w:w="5256" w:type="dxa"/>
+            <w:tcW w:w="8357" w:type="dxa"/>
             <w:tcBorders>
               <w:top w:val="single" w:sz="4" w:space="0" w:color="BFBFBF"/>
               <w:left w:val="single" w:sz="4" w:space="0" w:color="BFBFBF"/>
@@ -2232,21 +2228,15 @@
               <w:pStyle w:val="BodyText2"/>
             </w:pPr>
             <w:r>
-              <w:t>By design. Contact CPFR using the in-app link.</w:t>
+              <w:t>Use Vendor Number search and run the search first. The button appears only after a zero-result search.</w:t>
             </w:r>
           </w:p>
         </w:tc>
       </w:tr>
       <w:tr>
-        <w:tblPrEx>
-          <w:tblCellMar>
-            <w:top w:w="0" w:type="dxa"/>
-            <w:bottom w:w="0" w:type="dxa"/>
-          </w:tblCellMar>
-        </w:tblPrEx>
         <w:tc>
           <w:tcPr>
-            <w:tcW w:w="5256" w:type="dxa"/>
+            <w:tcW w:w="2155" w:type="dxa"/>
             <w:tcBorders>
               <w:top w:val="single" w:sz="4" w:space="0" w:color="BFBFBF"/>
               <w:left w:val="single" w:sz="4" w:space="0" w:color="BFBFBF"/>
@@ -2265,13 +2255,13 @@
               <w:pStyle w:val="BodyText2"/>
             </w:pPr>
             <w:r>
-              <w:t>Changes are not saving</w:t>
+              <w:t>Cannot select Tier1</w:t>
             </w:r>
           </w:p>
         </w:tc>
         <w:tc>
           <w:tcPr>
-            <w:tcW w:w="5256" w:type="dxa"/>
+            <w:tcW w:w="8357" w:type="dxa"/>
             <w:tcBorders>
               <w:top w:val="single" w:sz="4" w:space="0" w:color="BFBFBF"/>
               <w:left w:val="single" w:sz="4" w:space="0" w:color="BFBFBF"/>
@@ -2290,21 +2280,15 @@
               <w:pStyle w:val="BodyText2"/>
             </w:pPr>
             <w:r>
-              <w:t>Check inline error messages. Confirm you clicked both Save Changes and then Confirm Changes.</w:t>
+              <w:t>By design. Contact CPFR using the in-app link.</w:t>
             </w:r>
           </w:p>
         </w:tc>
       </w:tr>
       <w:tr>
-        <w:tblPrEx>
-          <w:tblCellMar>
-            <w:top w:w="0" w:type="dxa"/>
-            <w:bottom w:w="0" w:type="dxa"/>
-          </w:tblCellMar>
-        </w:tblPrEx>
         <w:tc>
           <w:tcPr>
-            <w:tcW w:w="5256" w:type="dxa"/>
+            <w:tcW w:w="2155" w:type="dxa"/>
             <w:tcBorders>
               <w:top w:val="single" w:sz="4" w:space="0" w:color="BFBFBF"/>
               <w:left w:val="single" w:sz="4" w:space="0" w:color="BFBFBF"/>
@@ -2323,13 +2307,13 @@
               <w:pStyle w:val="BodyText2"/>
             </w:pPr>
             <w:r>
-              <w:t>Table shows stale values</w:t>
+              <w:t>Changes are not saving</w:t>
             </w:r>
           </w:p>
         </w:tc>
         <w:tc>
           <w:tcPr>
-            <w:tcW w:w="5256" w:type="dxa"/>
+            <w:tcW w:w="8357" w:type="dxa"/>
             <w:tcBorders>
               <w:top w:val="single" w:sz="4" w:space="0" w:color="BFBFBF"/>
               <w:left w:val="single" w:sz="4" w:space="0" w:color="BFBFBF"/>
@@ -2348,6 +2332,58 @@
               <w:pStyle w:val="BodyText2"/>
             </w:pPr>
             <w:r>
+              <w:t>Check inline error messages. Confirm you clicked both Save Changes and then Confirm Changes.</w:t>
+            </w:r>
+          </w:p>
+        </w:tc>
+      </w:tr>
+      <w:tr>
+        <w:tc>
+          <w:tcPr>
+            <w:tcW w:w="2155" w:type="dxa"/>
+            <w:tcBorders>
+              <w:top w:val="single" w:sz="4" w:space="0" w:color="BFBFBF"/>
+              <w:left w:val="single" w:sz="4" w:space="0" w:color="BFBFBF"/>
+              <w:bottom w:val="single" w:sz="4" w:space="0" w:color="BFBFBF"/>
+              <w:right w:val="single" w:sz="4" w:space="0" w:color="BFBFBF"/>
+            </w:tcBorders>
+            <w:tcMar>
+              <w:top w:w="58" w:type="dxa"/>
+              <w:left w:w="100" w:type="dxa"/>
+              <w:bottom w:w="58" w:type="dxa"/>
+              <w:right w:w="100" w:type="dxa"/>
+            </w:tcMar>
+          </w:tcPr>
+          <w:p>
+            <w:pPr>
+              <w:pStyle w:val="BodyText2"/>
+            </w:pPr>
+            <w:r>
+              <w:t>Table shows stale values</w:t>
+            </w:r>
+          </w:p>
+        </w:tc>
+        <w:tc>
+          <w:tcPr>
+            <w:tcW w:w="8357" w:type="dxa"/>
+            <w:tcBorders>
+              <w:top w:val="single" w:sz="4" w:space="0" w:color="BFBFBF"/>
+              <w:left w:val="single" w:sz="4" w:space="0" w:color="BFBFBF"/>
+              <w:bottom w:val="single" w:sz="4" w:space="0" w:color="BFBFBF"/>
+              <w:right w:val="single" w:sz="4" w:space="0" w:color="BFBFBF"/>
+            </w:tcBorders>
+            <w:tcMar>
+              <w:top w:w="58" w:type="dxa"/>
+              <w:left w:w="100" w:type="dxa"/>
+              <w:bottom w:w="58" w:type="dxa"/>
+              <w:right w:w="100" w:type="dxa"/>
+            </w:tcMar>
+          </w:tcPr>
+          <w:p>
+            <w:pPr>
+              <w:pStyle w:val="BodyText2"/>
+            </w:pPr>
+            <w:r>
               <w:t>Click Refresh data on the table view.</w:t>
             </w:r>
           </w:p>
@@ -2401,10 +2437,10 @@
       </w:r>
     </w:p>
     <w:sectPr>
-      <w:headerReference w:type="default" r:id="rId8"/>
-      <w:footerReference w:type="default" r:id="rId9"/>
+      <w:headerReference w:type="default" r:id="rId9"/>
+      <w:footerReference w:type="default" r:id="rId10"/>
       <w:pgSz w:w="12240" w:h="15840"/>
-      <w:pgMar w:top="720" w:right="720" w:bottom="720" w:left="720" w:header="288" w:footer="288" w:gutter="288"/>
+      <w:pgMar w:top="720" w:right="720" w:bottom="720" w:left="720" w:header="432" w:footer="432" w:gutter="288"/>
       <w:lnNumType w:countBy="1" w:distance="360"/>
       <w:cols w:space="720"/>
       <w:docGrid w:linePitch="360"/>
@@ -2437,13 +2473,77 @@
   <w:p>
     <w:pPr>
       <w:pBdr>
-        <w:top w:val="single" w:sz="4" w:space="2" w:color="BFBFBF"/>
+        <w:top w:val="single" w:sz="4" w:space="4" w:color="BFBFBF"/>
       </w:pBdr>
       <w:tabs>
+        <w:tab w:val="center" w:pos="5220"/>
         <w:tab w:val="right" w:pos="10512"/>
       </w:tabs>
-      <w:spacing w:before="60"/>
+      <w:spacing w:before="120"/>
     </w:pPr>
+    <w:r>
+      <w:rPr>
+        <w:noProof/>
+        <w:color w:val="808080"/>
+        <w:sz w:val="16"/>
+        <w:szCs w:val="16"/>
+      </w:rPr>
+      <w:drawing>
+        <wp:anchor distT="0" distB="0" distL="114300" distR="114300" simplePos="0" relativeHeight="251658240" behindDoc="0" locked="0" layoutInCell="1" allowOverlap="1" wp14:anchorId="58635E11" wp14:editId="3BA40F25">
+          <wp:simplePos x="0" y="0"/>
+          <wp:positionH relativeFrom="column">
+            <wp:posOffset>3017520</wp:posOffset>
+          </wp:positionH>
+          <wp:positionV relativeFrom="paragraph">
+            <wp:posOffset>138430</wp:posOffset>
+          </wp:positionV>
+          <wp:extent cx="586740" cy="182880"/>
+          <wp:effectExtent l="0" t="0" r="0" b="0"/>
+          <wp:wrapNone/>
+          <wp:docPr id="1241323176" name="Picture 3"/>
+          <wp:cNvGraphicFramePr>
+            <a:graphicFrameLocks xmlns:a="http://schemas.openxmlformats.org/drawingml/2006/main" noChangeAspect="1"/>
+          </wp:cNvGraphicFramePr>
+          <a:graphic xmlns:a="http://schemas.openxmlformats.org/drawingml/2006/main">
+            <a:graphicData uri="http://schemas.openxmlformats.org/drawingml/2006/picture">
+              <pic:pic xmlns:pic="http://schemas.openxmlformats.org/drawingml/2006/picture">
+                <pic:nvPicPr>
+                  <pic:cNvPr id="1241323176" name="Picture 1241323176"/>
+                  <pic:cNvPicPr/>
+                </pic:nvPicPr>
+                <pic:blipFill>
+                  <a:blip r:embed="rId1">
+                    <a:extLst>
+                      <a:ext uri="{28A0092B-C50C-407E-A947-70E740481C1C}">
+                        <a14:useLocalDpi xmlns:a14="http://schemas.microsoft.com/office/drawing/2010/main" val="0"/>
+                      </a:ext>
+                    </a:extLst>
+                  </a:blip>
+                  <a:stretch>
+                    <a:fillRect/>
+                  </a:stretch>
+                </pic:blipFill>
+                <pic:spPr>
+                  <a:xfrm>
+                    <a:off x="0" y="0"/>
+                    <a:ext cx="586740" cy="182880"/>
+                  </a:xfrm>
+                  <a:prstGeom prst="rect">
+                    <a:avLst/>
+                  </a:prstGeom>
+                </pic:spPr>
+              </pic:pic>
+            </a:graphicData>
+          </a:graphic>
+          <wp14:sizeRelH relativeFrom="page">
+            <wp14:pctWidth>0</wp14:pctWidth>
+          </wp14:sizeRelH>
+          <wp14:sizeRelV relativeFrom="page">
+            <wp14:pctHeight>0</wp14:pctHeight>
+          </wp14:sizeRelV>
+        </wp:anchor>
+      </w:drawing>
+    </w:r>
     <w:r>
       <w:rPr>
         <w:color w:val="808080"/>
@@ -2459,6 +2559,21 @@
         <w:szCs w:val="16"/>
       </w:rPr>
       <w:tab/>
+    </w:r>
+    <w:r>
+      <w:rPr>
+        <w:color w:val="808080"/>
+        <w:sz w:val="16"/>
+        <w:szCs w:val="16"/>
+      </w:rPr>
+      <w:tab/>
+    </w:r>
+    <w:r>
+      <w:rPr>
+        <w:color w:val="808080"/>
+        <w:sz w:val="16"/>
+        <w:szCs w:val="16"/>
+      </w:rPr>
       <w:t xml:space="preserve">Page </w:t>
     </w:r>
     <w:r>
@@ -2533,9 +2648,10 @@
         <w:bottom w:val="single" w:sz="4" w:space="2" w:color="BFBFBF"/>
       </w:pBdr>
       <w:tabs>
+        <w:tab w:val="center" w:pos="5220"/>
         <w:tab w:val="right" w:pos="10512"/>
       </w:tabs>
-      <w:spacing w:after="60"/>
+      <w:spacing w:after="180"/>
     </w:pPr>
     <w:r>
       <w:rPr>
@@ -2543,7 +2659,23 @@
         <w:sz w:val="16"/>
         <w:szCs w:val="16"/>
       </w:rPr>
-      <w:t>CPFR VC Vendor Info Manager -- SOP</w:t>
+      <w:t>CPFR VC Vendor Info Manager</w:t>
+    </w:r>
+    <w:r>
+      <w:rPr>
+        <w:color w:val="808080"/>
+        <w:sz w:val="16"/>
+        <w:szCs w:val="16"/>
+      </w:rPr>
+      <w:t>—</w:t>
+    </w:r>
+    <w:r>
+      <w:rPr>
+        <w:color w:val="808080"/>
+        <w:sz w:val="16"/>
+        <w:szCs w:val="16"/>
+      </w:rPr>
+      <w:t>SOP</w:t>
     </w:r>
     <w:r>
       <w:rPr>
@@ -2552,7 +2684,31 @@
         <w:szCs w:val="16"/>
       </w:rPr>
       <w:tab/>
-      <w:t>Internal -- April 2026</w:t>
+    </w:r>
+    <w:r>
+      <w:rPr>
+        <w:color w:val="808080"/>
+        <w:sz w:val="16"/>
+        <w:szCs w:val="16"/>
+      </w:rPr>
+      <w:tab/>
+      <w:t>Internal</w:t>
+    </w:r>
+    <w:r>
+      <w:rPr>
+        <w:color w:val="808080"/>
+        <w:sz w:val="16"/>
+        <w:szCs w:val="16"/>
+      </w:rPr>
+      <w:t>—6</w:t>
+    </w:r>
+    <w:r>
+      <w:rPr>
+        <w:color w:val="808080"/>
+        <w:sz w:val="16"/>
+        <w:szCs w:val="16"/>
+      </w:rPr>
+      <w:t xml:space="preserve"> April 2026</w:t>
     </w:r>
   </w:p>
 </w:hdr>
@@ -3589,6 +3745,60 @@
       <w:contextualSpacing/>
     </w:pPr>
   </w:style>
+  <w:style w:type="character" w:styleId="FollowedHyperlink">
+    <w:name w:val="FollowedHyperlink"/>
+    <w:basedOn w:val="DefaultParagraphFont"/>
+    <w:uiPriority w:val="99"/>
+    <w:semiHidden/>
+    <w:unhideWhenUsed/>
+    <w:rsid w:val="00FB7B00"/>
+    <w:rPr>
+      <w:color w:val="96607D" w:themeColor="followedHyperlink"/>
+      <w:u w:val="single"/>
+    </w:rPr>
+  </w:style>
+  <w:style w:type="paragraph" w:styleId="Header">
+    <w:name w:val="header"/>
+    <w:basedOn w:val="Normal"/>
+    <w:link w:val="HeaderChar"/>
+    <w:uiPriority w:val="99"/>
+    <w:unhideWhenUsed/>
+    <w:rsid w:val="00FB7B00"/>
+    <w:pPr>
+      <w:tabs>
+        <w:tab w:val="center" w:pos="4680"/>
+        <w:tab w:val="right" w:pos="9360"/>
+      </w:tabs>
+    </w:pPr>
+  </w:style>
+  <w:style w:type="character" w:customStyle="1" w:styleId="HeaderChar">
+    <w:name w:val="Header Char"/>
+    <w:basedOn w:val="DefaultParagraphFont"/>
+    <w:link w:val="Header"/>
+    <w:uiPriority w:val="99"/>
+    <w:rsid w:val="00FB7B00"/>
+  </w:style>
+  <w:style w:type="paragraph" w:styleId="Footer">
+    <w:name w:val="footer"/>
+    <w:basedOn w:val="Normal"/>
+    <w:link w:val="FooterChar"/>
+    <w:uiPriority w:val="99"/>
+    <w:unhideWhenUsed/>
+    <w:rsid w:val="00FB7B00"/>
+    <w:pPr>
+      <w:tabs>
+        <w:tab w:val="center" w:pos="4680"/>
+        <w:tab w:val="right" w:pos="9360"/>
+      </w:tabs>
+    </w:pPr>
+  </w:style>
+  <w:style w:type="character" w:customStyle="1" w:styleId="FooterChar">
+    <w:name w:val="Footer Char"/>
+    <w:basedOn w:val="DefaultParagraphFont"/>
+    <w:link w:val="Footer"/>
+    <w:uiPriority w:val="99"/>
+    <w:rsid w:val="00FB7B00"/>
+  </w:style>
 </w:styles>
 </file>
 
@@ -3905,4 +4115,16 @@
     </a:ext>
   </a:extLst>
 </a:theme>
+</file>
+
+<file path=customXml/item1.xml><?xml version="1.0" encoding="utf-8"?>
+<b:Sources xmlns:b="http://schemas.openxmlformats.org/officeDocument/2006/bibliography" xmlns="http://schemas.openxmlformats.org/officeDocument/2006/bibliography" SelectedStyle="/APASixthEditionOfficeOnline.xsl" StyleName="APA" Version="6"/>
+</file>
+
+<file path=customXml/itemProps1.xml><?xml version="1.0" encoding="utf-8"?>
+<ds:datastoreItem xmlns:ds="http://schemas.openxmlformats.org/officeDocument/2006/customXml" ds:itemID="{57573956-AB96-FD4C-80D4-B314AE0E7FD3}">
+  <ds:schemaRefs>
+    <ds:schemaRef ds:uri="http://schemas.openxmlformats.org/officeDocument/2006/bibliography"/>
+  </ds:schemaRefs>
+</ds:datastoreItem>
 </file>
</xml_diff>

<commit_message>
Update Batch Add Scripts & Vendor Info Manager SOP
</commit_message>
<xml_diff>
--- a/cpfr-vc-mgrmicro/CPFR_VC_Vendor_Info_Manager_SOP.docx
+++ b/cpfr-vc-mgrmicro/CPFR_VC_Vendor_Info_Manager_SOP.docx
@@ -7,7 +7,13 @@
         <w:pStyle w:val="Heading1"/>
       </w:pPr>
       <w:r>
-        <w:t>CPFR VC Vendor Info Manager -- Standard Operating Procedure</w:t>
+        <w:t>CPFR VC Vendor Info Manager</w:t>
+      </w:r>
+      <w:r>
+        <w:t>—</w:t>
+      </w:r>
+      <w:r>
+        <w:t>Standard Operating Procedure</w:t>
       </w:r>
     </w:p>
     <w:tbl>
@@ -78,7 +84,7 @@
               <w:pStyle w:val="BodyText2"/>
             </w:pPr>
             <w:r>
-              <w:t>CPFR / Inventory Management (update as needed)</w:t>
+              <w:t>Instock Program Team</w:t>
             </w:r>
           </w:p>
         </w:tc>
@@ -130,7 +136,7 @@
               <w:pStyle w:val="BodyText2"/>
             </w:pPr>
             <w:r>
-              <w:t>Inventory Management leadership (update as needed)</w:t>
+              <w:t>Inventory Management leadership</w:t>
             </w:r>
           </w:p>
         </w:tc>
@@ -252,7 +258,25 @@
         <w:t>Audience:</w:t>
       </w:r>
       <w:r>
-        <w:t xml:space="preserve"> Instock Managers (ISMs), Category Managers (CMs), and VC personnel who maintain vendor distribution and contact data for CPFR communications.</w:t>
+        <w:t xml:space="preserve"> Instock Managers (ISMs), Category Managers (CMs),</w:t>
+      </w:r>
+      <w:r>
+        <w:t xml:space="preserve"> Vendor Compliance</w:t>
+      </w:r>
+      <w:r>
+        <w:t xml:space="preserve"> </w:t>
+      </w:r>
+      <w:r>
+        <w:t>(</w:t>
+      </w:r>
+      <w:r>
+        <w:t>VC</w:t>
+      </w:r>
+      <w:r>
+        <w:t>), and adjacent Supply Chain</w:t>
+      </w:r>
+      <w:r>
+        <w:t xml:space="preserve"> personnel who maintain vendor distribution and contact data for CPFR communications.</w:t>
       </w:r>
     </w:p>
     <w:p>
@@ -267,7 +291,13 @@
         <w:t>Confidentiality:</w:t>
       </w:r>
       <w:r>
-        <w:t xml:space="preserve"> Chewy Confidential -- For Internal Use Only</w:t>
+        <w:t xml:space="preserve"> Chewy Confidential</w:t>
+      </w:r>
+      <w:r>
+        <w:t>—</w:t>
+      </w:r>
+      <w:r>
+        <w:t>For Internal Use Only</w:t>
       </w:r>
     </w:p>
     <w:p>
@@ -381,19 +411,7 @@
           <w:rPr>
             <w:rStyle w:val="Hyperlink"/>
           </w:rPr>
-          <w:t>https://app.snowflake.com/streamlit/chewy/chewy/#/</w:t>
-        </w:r>
-        <w:r>
-          <w:rPr>
-            <w:rStyle w:val="Hyperlink"/>
-          </w:rPr>
-          <w:t>a</w:t>
-        </w:r>
-        <w:r>
-          <w:rPr>
-            <w:rStyle w:val="Hyperlink"/>
-          </w:rPr>
-          <w:t>pps/z3y7n6izoatbnpebwxgq</w:t>
+          <w:t>https://app.snowflake.com/streamlit/chewy/chewy/#/apps/z3y7n6izoatbnpebwxgq</w:t>
         </w:r>
       </w:hyperlink>
     </w:p>
@@ -436,7 +454,24 @@
         <w:t>Tier</w:t>
       </w:r>
       <w:r>
-        <w:t xml:space="preserve"> value that determines its CPFR distribution tier. The options are:</w:t>
+        <w:t xml:space="preserve"> value that determines </w:t>
+      </w:r>
+      <w:r>
+        <w:t>the amount of data shared in</w:t>
+      </w:r>
+      <w:r>
+        <w:t xml:space="preserve"> CPFR distribution </w:t>
+      </w:r>
+      <w:r>
+        <w:t>for that vendor.</w:t>
+      </w:r>
+    </w:p>
+    <w:p>
+      <w:pPr>
+        <w:spacing w:before="120" w:after="120" w:line="264" w:lineRule="auto"/>
+      </w:pPr>
+      <w:r>
+        <w:t>The options are:</w:t>
       </w:r>
     </w:p>
     <w:tbl>
@@ -569,7 +604,13 @@
               <w:pStyle w:val="BodyText2"/>
             </w:pPr>
             <w:r>
-              <w:t>Strategic vendors. Managed at the parent-company level. Tier1 records require CPFR vetting before they are created or reclassified, because the way vendor identity is keyed for Tier1 differs from other tiers. You cannot set a record to Tier1 in this app — contact CPFR.</w:t>
+              <w:t xml:space="preserve">Strategic vendors. Managed at the parent-company level. Tier1 records require CPFR vetting before they are created or reclassified, because the way vendor identity is keyed for Tier1 differs from other tiers. You </w:t>
+            </w:r>
+            <w:r>
+              <w:t xml:space="preserve">may edit contact info for Tier1 vendors, but </w:t>
+            </w:r>
+            <w:r>
+              <w:t>cannot set a record to Tier1 in this app—contact CPFR.</w:t>
             </w:r>
           </w:p>
         </w:tc>
@@ -621,7 +662,13 @@
               <w:pStyle w:val="BodyText2"/>
             </w:pPr>
             <w:r>
-              <w:t>High-touch vendors. Data shared includes the 6-month forecast (same as below) plus Inventory, consisting of [OH, OO, AS Demand, PDP OOS%, Fill-Rate%, and DOS]</w:t>
+              <w:t xml:space="preserve">High-touch vendors. Data shared includes the 6-month forecast (same as below) plus </w:t>
+            </w:r>
+            <w:r>
+              <w:t>i</w:t>
+            </w:r>
+            <w:r>
+              <w:t>nventory, consisting of [OH, OO, AS Demand, PDP OOS%, Fill-Rate%, and DOS]</w:t>
             </w:r>
           </w:p>
         </w:tc>
@@ -738,6 +785,9 @@
             <w:r>
               <w:t>No tier assigned.</w:t>
             </w:r>
+            <w:r>
+              <w:t xml:space="preserve"> This allows VC/Chargeback to continue using contacts info, but no CPFR report is sent.</w:t>
+            </w:r>
           </w:p>
         </w:tc>
       </w:tr>
@@ -821,7 +871,21 @@
         <w:pStyle w:val="ListBullet"/>
       </w:pPr>
       <w:r>
-        <w:t>The other email fields (Category Manager, In-Stock Manager, and their respective AD emails) are maintained for visibility and downstream use.</w:t>
+        <w:t xml:space="preserve">The other email fields (Category Manager, In-Stock Manager, and their respective AD emails) are maintained for </w:t>
+      </w:r>
+      <w:proofErr w:type="gramStart"/>
+      <w:r>
+        <w:t>visibility</w:t>
+      </w:r>
+      <w:proofErr w:type="gramEnd"/>
+      <w:r>
+        <w:t xml:space="preserve"> and </w:t>
+      </w:r>
+      <w:r>
+        <w:t>their accuracy is</w:t>
+      </w:r>
+      <w:r>
+        <w:t xml:space="preserve"> critically important for escalations and approvals.</w:t>
       </w:r>
     </w:p>
     <w:p>
@@ -929,6 +993,26 @@
       <w:r>
         <w:t xml:space="preserve"> to discard.</w:t>
       </w:r>
+      <w:r>
+        <w:br/>
+        <w:t xml:space="preserve">        ** </w:t>
+      </w:r>
+      <w:proofErr w:type="gramStart"/>
+      <w:r>
+        <w:t>IMPORTANT!:</w:t>
+      </w:r>
+      <w:proofErr w:type="gramEnd"/>
+      <w:r>
+        <w:t xml:space="preserve"> Nothing will be saved until you click ‘Confirm Changes</w:t>
+      </w:r>
+      <w:proofErr w:type="gramStart"/>
+      <w:r>
+        <w:t>’.*</w:t>
+      </w:r>
+      <w:proofErr w:type="gramEnd"/>
+      <w:r>
+        <w:t>*</w:t>
+      </w:r>
     </w:p>
     <w:p>
       <w:pPr>
@@ -953,7 +1037,10 @@
         <w:spacing w:before="120" w:after="120" w:line="264" w:lineRule="auto"/>
       </w:pPr>
       <w:r>
-        <w:t>Adding a new vendor works similarly but completes on a single screen with an inline confirmation rather than a separate receipt.</w:t>
+        <w:t>Adding a new vendor works similarly but completes on a single screen with an inline confirmation</w:t>
+      </w:r>
+      <w:r>
+        <w:t>.</w:t>
       </w:r>
     </w:p>
     <w:p>
@@ -2031,22 +2118,7 @@
               <w:pStyle w:val="BodyText2"/>
             </w:pPr>
             <w:r>
-              <w:t>The tool may require up to 30 seconds to come on</w:t>
-            </w:r>
-            <w:r>
-              <w:t>-</w:t>
-            </w:r>
-            <w:r>
-              <w:t>line.</w:t>
-            </w:r>
-            <w:r>
-              <w:t xml:space="preserve"> The search button will turn blue when the tool has finished loading and is ready for use.</w:t>
-            </w:r>
-            <w:r>
-              <w:t xml:space="preserve"> </w:t>
-            </w:r>
-            <w:r>
-              <w:t>If you still experience issues, v</w:t>
+              <w:t>The tool may require up to 30 seconds to come on-line. The search button will turn blue when the tool has finished loading and is ready for use. If you still experience issues, v</w:t>
             </w:r>
             <w:r>
               <w:t xml:space="preserve">erify your Snowflake session is </w:t>
@@ -2058,6 +2130,9 @@
             <w:proofErr w:type="gramEnd"/>
             <w:r>
               <w:t xml:space="preserve"> and your network allows Snowflake traffic. Retry after a moment.</w:t>
+            </w:r>
+            <w:r>
+              <w:t xml:space="preserve"> Contact CPFR team if you continue to experience problems accessing the tool.</w:t>
             </w:r>
           </w:p>
         </w:tc>
@@ -2421,7 +2496,13 @@
         <w:spacing w:before="120" w:after="120" w:line="264" w:lineRule="auto"/>
       </w:pPr>
       <w:r>
-        <w:t>When you reach out, include: the vendor number, approximately when the change occurred, what you expected vs. what you see, and a screenshot of the receipt or Changes Summary if you have one.</w:t>
+        <w:t>When you reach out, include: the vendor number, approximately when the change occurred, what you expected vs. what you see, and a screenshot of the receipt or Changes Summary</w:t>
+      </w:r>
+      <w:r>
+        <w:t xml:space="preserve"> in the tool</w:t>
+      </w:r>
+      <w:r>
+        <w:t xml:space="preserve"> if you have one.</w:t>
       </w:r>
     </w:p>
     <w:p>

</xml_diff>